<commit_message>
docs(thesis): harden the paper build and correct overstated log and figure claims
Missing GLUE/identifiability citations are added to refs.bib, and build.sh now
fails hard on unresolved keys, auto-copies regenerated figures, and can hold
sections out of the Word count with EXCLUDE markers. Several claims that did
not survive a second reading of the artifacts are tightened: the noisy grid
fits do not all land on the nearest-node triple, fig. 6 no longer says every
unobserved zone returns to its prior, and the top-10 hot-spot overlap is nine
of ten rather than eight.

Co-authored-by: Cursor <cursoragent@cursor.com>
</commit_message>
<xml_diff>
--- a/thesis/paper.docx
+++ b/thesis/paper.docx
@@ -2,6 +2,106 @@
 <file path=word/document.xml><?xml version="1.0" encoding="utf-8"?>
 <w:document xmlns:w="http://schemas.openxmlformats.org/wordprocessingml/2006/main" xmlns:m="http://schemas.openxmlformats.org/officeDocument/2006/math" xmlns:r="http://schemas.openxmlformats.org/officeDocument/2006/relationships" xmlns:o="urn:schemas-microsoft-com:office:office" xmlns:v="urn:schemas-microsoft-com:vml" xmlns:w10="urn:schemas-microsoft-com:office:word" xmlns:a="http://schemas.openxmlformats.org/drawingml/2006/main" xmlns:pic="http://schemas.openxmlformats.org/drawingml/2006/picture" xmlns:wp="http://schemas.openxmlformats.org/drawingml/2006/wordprocessingDrawing">
   <w:body>
+    <w:p>
+      <w:pPr>
+        <w:pStyle w:val="Title"/>
+      </w:pPr>
+      <w:r>
+        <w:t xml:space="preserve">Identifiability, Prediction and Decision Robustness in Grouped Chlorine Wall-Decay Calibration: A Controlled EPANET Net3 Study</w:t>
+      </w:r>
+    </w:p>
+    <w:p>
+      <w:pPr>
+        <w:pStyle w:val="Author"/>
+      </w:pPr>
+      <w:r>
+        <w:t xml:space="preserve">Ruixin Peng</w:t>
+      </w:r>
+    </w:p>
+    <w:p>
+      <w:pPr>
+        <w:pStyle w:val="Date"/>
+      </w:pPr>
+      <w:r>
+        <w:t xml:space="preserve">August 2026</w:t>
+      </w:r>
+    </w:p>
+    <w:p>
+      <w:pPr>
+        <w:pStyle w:val="FirstParagraph"/>
+      </w:pPr>
+      <w:r>
+        <w:rPr>
+          <w:b/>
+          <w:bCs/>
+        </w:rPr>
+        <w:t xml:space="preserve">Programme:</w:t>
+      </w:r>
+      <w:r>
+        <w:t xml:space="preserve"> </w:t>
+      </w:r>
+      <w:r>
+        <w:t xml:space="preserve">MSc [PROGRAMME — to confirm], Department of Civil and Environmental Engineering,</w:t>
+      </w:r>
+      <w:r>
+        <w:t xml:space="preserve"> </w:t>
+      </w:r>
+      <w:r>
+        <w:t xml:space="preserve">Imperial College London</w:t>
+      </w:r>
+    </w:p>
+    <w:p>
+      <w:pPr>
+        <w:pStyle w:val="BodyText"/>
+      </w:pPr>
+      <w:r>
+        <w:rPr>
+          <w:b/>
+          <w:bCs/>
+        </w:rPr>
+        <w:t xml:space="preserve">CID:</w:t>
+      </w:r>
+      <w:r>
+        <w:t xml:space="preserve"> </w:t>
+      </w:r>
+      <w:r>
+        <w:t xml:space="preserve">[CID — to confirm]</w:t>
+      </w:r>
+      <w:r>
+        <w:t xml:space="preserve"> </w:t>
+      </w:r>
+      <w:r>
+        <w:rPr>
+          <w:b/>
+          <w:bCs/>
+        </w:rPr>
+        <w:t xml:space="preserve">Supervisor:</w:t>
+      </w:r>
+      <w:r>
+        <w:t xml:space="preserve"> </w:t>
+      </w:r>
+      <w:r>
+        <w:t xml:space="preserve">[FIRST SUPERVISOR — to confirm]</w:t>
+      </w:r>
+    </w:p>
+    <w:p>
+      <w:pPr>
+        <w:pStyle w:val="BodyText"/>
+      </w:pPr>
+      <w:r>
+        <w:rPr>
+          <w:b/>
+          <w:bCs/>
+        </w:rPr>
+        <w:t xml:space="preserve">Module:</w:t>
+      </w:r>
+      <w:r>
+        <w:t xml:space="preserve"> </w:t>
+      </w:r>
+      <w:r>
+        <w:t xml:space="preserve">CIVE70058 Research Paper</w:t>
+      </w:r>
+    </w:p>
     <w:bookmarkStart w:id="9" w:name="abstract"/>
     <w:p>
       <w:pPr>
@@ -78,55 +178,61 @@
         <w:pStyle w:val="BodyText"/>
       </w:pPr>
       <w:r>
-        <w:t xml:space="preserve">The formal rule contracted all three coefficients to 25-31% of their prior standard deviation,</w:t>
-      </w:r>
-      <w:r>
-        <w:t xml:space="preserve"> </w:t>
-      </w:r>
-      <w:r>
-        <w:t xml:space="preserve">whereas the informal score retained 86-98% — a difference produced by the weighting alone, since</w:t>
-      </w:r>
-      <w:r>
-        <w:t xml:space="preserve"> </w:t>
-      </w:r>
-      <w:r>
-        <w:t xml:space="preserve">both used the same 294 observations. Recalibration over 100 noise realisations gave estimator</w:t>
-      </w:r>
-      <w:r>
-        <w:t xml:space="preserve"> </w:t>
-      </w:r>
-      <w:r>
-        <w:t xml:space="preserve">spreads 1.04 to 1.12 times the Cramer-Rao bound. Systematic sensor error, bulk-decay</w:t>
-      </w:r>
-      <w:r>
-        <w:t xml:space="preserve"> </w:t>
-      </w:r>
-      <w:r>
-        <w:t xml:space="preserve">misspecification and length-structured heterogeneity displaced coefficients by up to six</w:t>
-      </w:r>
-      <w:r>
-        <w:t xml:space="preserve"> </w:t>
-      </w:r>
-      <w:r>
-        <w:t xml:space="preserve">posterior standard deviations while the fit remained at the noise floor. Yet a withheld zone’s</w:t>
-      </w:r>
-      <w:r>
-        <w:t xml:space="preserve"> </w:t>
-      </w:r>
-      <w:r>
-        <w:t xml:space="preserve">coefficient could revert entirely to its prior with held-out prediction unchanged, and</w:t>
-      </w:r>
-      <w:r>
-        <w:t xml:space="preserve"> </w:t>
-      </w:r>
-      <w:r>
-        <w:t xml:space="preserve">displacements of several standard deviations left network-wide rankings intact while altering</w:t>
-      </w:r>
-      <w:r>
-        <w:t xml:space="preserve"> </w:t>
-      </w:r>
-      <w:r>
-        <w:t xml:space="preserve">the six-node operational shortlist under one risk metric but not another.</w:t>
+        <w:t xml:space="preserve">The formal rule contracted all three coefficients to 25–31% of their prior standard deviation,</w:t>
+      </w:r>
+      <w:r>
+        <w:t xml:space="preserve"> </w:t>
+      </w:r>
+      <w:r>
+        <w:t xml:space="preserve">whereas the informal score at its original 0.120 mg L</w:t>
+      </w:r>
+      <w:r>
+        <w:rPr>
+          <w:vertAlign w:val="superscript"/>
+        </w:rPr>
+        <w:t xml:space="preserve">-1</w:t>
+      </w:r>
+      <w:r>
+        <w:t xml:space="preserve"> </w:t>
+      </w:r>
+      <w:r>
+        <w:t xml:space="preserve">behavioural threshold retained 86–98%. Both rules used the same 294 observations, so the difference is produced by the weighting alone.</w:t>
+      </w:r>
+      <w:r>
+        <w:t xml:space="preserve"> </w:t>
+      </w:r>
+      <w:r>
+        <w:t xml:space="preserve">Recalibration over 100 noise realisations gave estimator spreads 1.04 to 1.12 times the</w:t>
+      </w:r>
+      <w:r>
+        <w:t xml:space="preserve"> </w:t>
+      </w:r>
+      <w:r>
+        <w:t xml:space="preserve">Cramér–Rao bound. Systematic sensor error, bulk-decay misspecification and length-structured</w:t>
+      </w:r>
+      <w:r>
+        <w:t xml:space="preserve"> </w:t>
+      </w:r>
+      <w:r>
+        <w:t xml:space="preserve">heterogeneity displaced coefficients by up to six posterior standard deviations while aggregate</w:t>
+      </w:r>
+      <w:r>
+        <w:t xml:space="preserve"> </w:t>
+      </w:r>
+      <w:r>
+        <w:t xml:space="preserve">fit remained at the noise floor. Yet a withheld zone’s coefficient could revert entirely to its</w:t>
+      </w:r>
+      <w:r>
+        <w:t xml:space="preserve"> </w:t>
+      </w:r>
+      <w:r>
+        <w:t xml:space="preserve">prior with held-out prediction unchanged, and displacements of several standard deviations</w:t>
+      </w:r>
+      <w:r>
+        <w:t xml:space="preserve"> </w:t>
+      </w:r>
+      <w:r>
+        <w:t xml:space="preserve">largely preserved whole-network rank order, with Spearman rank correlation of 0.93 to 0.98 under bulk-decay misspecification, but they altered the six-node operational shortlist under one risk metric and not another.</w:t>
       </w:r>
     </w:p>
     <w:p>
@@ -140,13 +246,13 @@
         <w:t xml:space="preserve"> </w:t>
       </w:r>
       <w:r>
-        <w:t xml:space="preserve">validation. All conclusions are bounded by a synthetic, internally validated design without</w:t>
-      </w:r>
-      <w:r>
-        <w:t xml:space="preserve"> </w:t>
-      </w:r>
-      <w:r>
-        <w:t xml:space="preserve">field data.</w:t>
+        <w:t xml:space="preserve">validation. All conclusions are bounded by a synthetic known-truth design with internal hold-out</w:t>
+      </w:r>
+      <w:r>
+        <w:t xml:space="preserve"> </w:t>
+      </w:r>
+      <w:r>
+        <w:t xml:space="preserve">evaluation and no field data.</w:t>
       </w:r>
     </w:p>
     <w:bookmarkEnd w:id="9"/>
@@ -321,25 +427,13 @@
         <w:t xml:space="preserve"> </w:t>
       </w:r>
       <w:r>
-        <w:t xml:space="preserve">independently from controlled bottle tests, whereas wall decay is less directly observable —</w:t>
-      </w:r>
-      <w:r>
-        <w:t xml:space="preserve"> </w:t>
-      </w:r>
-      <w:r>
-        <w:t xml:space="preserve">depending on pipe-surface condition, corrosion products, deposits and biofilm — and generally</w:t>
-      </w:r>
-      <w:r>
-        <w:t xml:space="preserve"> </w:t>
-      </w:r>
-      <w:r>
-        <w:t xml:space="preserve">has to be inferred from pipe-loop or field concentration data after accounting for bulk decay</w:t>
-      </w:r>
-      <w:r>
-        <w:t xml:space="preserve"> </w:t>
-      </w:r>
-      <w:r>
-        <w:t xml:space="preserve">(Hallam</w:t>
+        <w:t xml:space="preserve">independently from controlled bottle tests, whereas wall decay is less directly observable. It depends on pipe-surface condition, corrosion products, deposits and biofilm, and generally has to be inferred from pipe-loop or field concentration data after accounting for bulk decay</w:t>
+      </w:r>
+      <w:r>
+        <w:t xml:space="preserve"> </w:t>
+      </w:r>
+      <w:r>
+        <w:t xml:space="preserve">(Powell</w:t>
       </w:r>
       <w:r>
         <w:t xml:space="preserve"> </w:t>
@@ -352,41 +446,7 @@
         <w:t xml:space="preserve">et al.</w:t>
       </w:r>
       <w:r>
-        <w:t xml:space="preserve">, 2002;</w:t>
-      </w:r>
-      <w:r>
-        <w:t xml:space="preserve"> </w:t>
-      </w:r>
-      <w:r>
-        <w:rPr>
-          <w:b/>
-          <w:bCs/>
-        </w:rPr>
-        <w:t xml:space="preserve">Powell2000?</w:t>
-      </w:r>
-      <w:r>
-        <w:t xml:space="preserve">)</w:t>
-      </w:r>
-      <w:r>
-        <w:t xml:space="preserve">. Because networks contain far more pipes than monitors, wall</w:t>
-      </w:r>
-      <w:r>
-        <w:t xml:space="preserve"> </w:t>
-      </w:r>
-      <w:r>
-        <w:t xml:space="preserve">coefficients are commonly estimated for groups of pipes rather than individually, with grouping</w:t>
-      </w:r>
-      <w:r>
-        <w:t xml:space="preserve"> </w:t>
-      </w:r>
-      <w:r>
-        <w:t xml:space="preserve">based on whatever physical or spatial information is available</w:t>
-      </w:r>
-      <w:r>
-        <w:t xml:space="preserve"> </w:t>
-      </w:r>
-      <w:r>
-        <w:t xml:space="preserve">(Munavalli and Mohan Kumar, 2003; Nejjari</w:t>
+        <w:t xml:space="preserve">, 2000; Hallam</w:t>
       </w:r>
       <w:r>
         <w:t xml:space="preserve"> </w:t>
@@ -399,6 +459,40 @@
         <w:t xml:space="preserve">et al.</w:t>
       </w:r>
       <w:r>
+        <w:t xml:space="preserve">, 2002)</w:t>
+      </w:r>
+      <w:r>
+        <w:t xml:space="preserve">. Because networks contain far more pipes than monitors, wall</w:t>
+      </w:r>
+      <w:r>
+        <w:t xml:space="preserve"> </w:t>
+      </w:r>
+      <w:r>
+        <w:t xml:space="preserve">coefficients are commonly estimated for groups of pipes rather than individually, with grouping</w:t>
+      </w:r>
+      <w:r>
+        <w:t xml:space="preserve"> </w:t>
+      </w:r>
+      <w:r>
+        <w:t xml:space="preserve">based on whatever physical or spatial information is available</w:t>
+      </w:r>
+      <w:r>
+        <w:t xml:space="preserve"> </w:t>
+      </w:r>
+      <w:r>
+        <w:t xml:space="preserve">(Munavalli and Mohan Kumar, 2003; Nejjari</w:t>
+      </w:r>
+      <w:r>
+        <w:t xml:space="preserve"> </w:t>
+      </w:r>
+      <w:r>
+        <w:rPr>
+          <w:i/>
+          <w:iCs/>
+        </w:rPr>
+        <w:t xml:space="preserve">et al.</w:t>
+      </w:r>
+      <w:r>
         <w:t xml:space="preserve">, 2014)</w:t>
       </w:r>
       <w:r>
@@ -434,19 +528,7 @@
         <w:t xml:space="preserve"> </w:t>
       </w:r>
       <w:r>
-        <w:t xml:space="preserve">calibration may therefore fail at several distinct levels — recovering its parameters poorly,</w:t>
-      </w:r>
-      <w:r>
-        <w:t xml:space="preserve"> </w:t>
-      </w:r>
-      <w:r>
-        <w:t xml:space="preserve">predicting poorly, or giving an unstable operational prioritisation — and these failures need</w:t>
-      </w:r>
-      <w:r>
-        <w:t xml:space="preserve"> </w:t>
-      </w:r>
-      <w:r>
-        <w:t xml:space="preserve">not occur together.</w:t>
+        <w:t xml:space="preserve">calibration may therefore fail at several distinct levels. It may recover its parameters poorly, predict poorly, or give an unstable operational prioritisation, and these failures need not occur together.</w:t>
       </w:r>
     </w:p>
     <w:bookmarkEnd w:id="10"/>
@@ -538,54 +620,47 @@
         <w:t xml:space="preserve"> </w:t>
       </w:r>
       <w:r>
-        <w:t xml:space="preserve">(</w:t>
+        <w:t xml:space="preserve">(Brun, Reichert and Künsch, 2001)</w:t>
+      </w:r>
+      <w:r>
+        <w:t xml:space="preserve">. Practical</w:t>
+      </w:r>
+      <w:r>
+        <w:t xml:space="preserve"> </w:t>
+      </w:r>
+      <w:r>
+        <w:t xml:space="preserve">identifiability additionally concerns whether the finite, noisy observations actually available</w:t>
+      </w:r>
+      <w:r>
+        <w:t xml:space="preserve"> </w:t>
+      </w:r>
+      <w:r>
+        <w:t xml:space="preserve">constrain the parameters sufficiently, for which profile likelihood gives a direct</w:t>
+      </w:r>
+      <w:r>
+        <w:t xml:space="preserve"> </w:t>
+      </w:r>
+      <w:r>
+        <w:t xml:space="preserve">likelihood-based diagnostic</w:t>
+      </w:r>
+      <w:r>
+        <w:t xml:space="preserve"> </w:t>
+      </w:r>
+      <w:r>
+        <w:t xml:space="preserve">(Raue</w:t>
+      </w:r>
+      <w:r>
+        <w:t xml:space="preserve"> </w:t>
       </w:r>
       <w:r>
         <w:rPr>
-          <w:b/>
-          <w:bCs/>
+          <w:i/>
+          <w:iCs/>
         </w:rPr>
-        <w:t xml:space="preserve">Brun2001?</w:t>
-      </w:r>
-      <w:r>
-        <w:t xml:space="preserve">)</w:t>
-      </w:r>
-      <w:r>
-        <w:t xml:space="preserve">. Practical</w:t>
-      </w:r>
-      <w:r>
-        <w:t xml:space="preserve"> </w:t>
-      </w:r>
-      <w:r>
-        <w:t xml:space="preserve">identifiability additionally concerns whether the finite, noisy observations actually available</w:t>
-      </w:r>
-      <w:r>
-        <w:t xml:space="preserve"> </w:t>
-      </w:r>
-      <w:r>
-        <w:t xml:space="preserve">constrain the parameters sufficiently, for which profile likelihood gives a direct</w:t>
-      </w:r>
-      <w:r>
-        <w:t xml:space="preserve"> </w:t>
-      </w:r>
-      <w:r>
-        <w:t xml:space="preserve">likelihood-based diagnostic</w:t>
-      </w:r>
-      <w:r>
-        <w:t xml:space="preserve"> </w:t>
-      </w:r>
-      <w:r>
-        <w:t xml:space="preserve">(</w:t>
-      </w:r>
-      <w:r>
-        <w:rPr>
-          <w:b/>
-          <w:bCs/>
-        </w:rPr>
-        <w:t xml:space="preserve">Raue2009?</w:t>
-      </w:r>
-      <w:r>
-        <w:t xml:space="preserve">)</w:t>
+        <w:t xml:space="preserve">et al.</w:t>
+      </w:r>
+      <w:r>
+        <w:t xml:space="preserve">, 2009)</w:t>
       </w:r>
       <w:r>
         <w:t xml:space="preserve">; repeated-sampling experiments can then test whether the</w:t>
@@ -721,30 +796,20 @@
         <w:t xml:space="preserve"> </w:t>
       </w:r>
       <w:r>
-        <w:t xml:space="preserve">(</w:t>
+        <w:t xml:space="preserve">(Mantovan and Todini, 2006; Stedinger</w:t>
+      </w:r>
+      <w:r>
+        <w:t xml:space="preserve"> </w:t>
       </w:r>
       <w:r>
         <w:rPr>
-          <w:b/>
-          <w:bCs/>
+          <w:i/>
+          <w:iCs/>
         </w:rPr>
-        <w:t xml:space="preserve">MantovanTodini2006?</w:t>
-      </w:r>
-      <w:r>
-        <w:t xml:space="preserve">;</w:t>
-      </w:r>
-      <w:r>
-        <w:t xml:space="preserve"> </w:t>
-      </w:r>
-      <w:r>
-        <w:rPr>
-          <w:b/>
-          <w:bCs/>
-        </w:rPr>
-        <w:t xml:space="preserve">Stedinger2008?</w:t>
-      </w:r>
-      <w:r>
-        <w:t xml:space="preserve">)</w:t>
+        <w:t xml:space="preserve">et al.</w:t>
+      </w:r>
+      <w:r>
+        <w:t xml:space="preserve">, 2008)</w:t>
       </w:r>
       <w:r>
         <w:t xml:space="preserve">. The controlled setting used here sidesteps that broader debate rather than</w:t>
@@ -797,19 +862,7 @@
         <w:t xml:space="preserve"> </w:t>
       </w:r>
       <w:r>
-        <w:t xml:space="preserve">within-group heterogeneity act on the inverse problem in different ways, so their effects need</w:t>
-      </w:r>
-      <w:r>
-        <w:t xml:space="preserve"> </w:t>
-      </w:r>
-      <w:r>
-        <w:t xml:space="preserve">to be distinguished — loss of precision from displacement of the estimate — and placed on a</w:t>
-      </w:r>
-      <w:r>
-        <w:t xml:space="preserve"> </w:t>
-      </w:r>
-      <w:r>
-        <w:t xml:space="preserve">common scale.</w:t>
+        <w:t xml:space="preserve">within-group heterogeneity act on the inverse problem in different ways, so their effects need to be distinguished, separating loss of precision from displacement of the estimate, and placed on a common scale.</w:t>
       </w:r>
     </w:p>
     <w:p>
@@ -3134,25 +3187,7 @@
         <w:t xml:space="preserve"> </w:t>
       </w:r>
       <w:r>
-        <w:t xml:space="preserve">than to sampling or to different forward simulations. Experiments that altered the prior domain</w:t>
-      </w:r>
-      <w:r>
-        <w:t xml:space="preserve"> </w:t>
-      </w:r>
-      <w:r>
-        <w:t xml:space="preserve">or a forward-model parameter — the displaced-prior tests of Section 2.4.2, the bulk-decay cases</w:t>
-      </w:r>
-      <w:r>
-        <w:t xml:space="preserve"> </w:t>
-      </w:r>
-      <w:r>
-        <w:t xml:space="preserve">of Section 2.5.5 and the scenarios of Section 2.8.4 — generated their own prediction libraries</w:t>
-      </w:r>
-      <w:r>
-        <w:t xml:space="preserve"> </w:t>
-      </w:r>
-      <w:r>
-        <w:t xml:space="preserve">under the same sampling principles.</w:t>
+        <w:t xml:space="preserve">than to sampling or to different forward simulations. Experiments that altered the prior domain or a forward-model parameter generated their own prediction libraries under the same sampling principles. These were the displaced-prior tests of Section 2.4.2, the bulk-decay cases of Section 2.5.5 and the scenarios of Section 2.8.4.</w:t>
       </w:r>
     </w:p>
     <w:p>
@@ -5778,19 +5813,7 @@
         <w:t xml:space="preserve"> </w:t>
       </w:r>
       <w:r>
-        <w:t xml:space="preserve">individual</w:t>
-      </w:r>
-      <w:r>
-        <w:t xml:space="preserve"> </w:t>
-      </w:r>
-      <w:r>
-        <w:t xml:space="preserve">realisations — the last of these asking whether the uncertainty a single calibration claims</w:t>
-      </w:r>
-      <w:r>
-        <w:t xml:space="preserve"> </w:t>
-      </w:r>
-      <w:r>
-        <w:t xml:space="preserve">matches the estimator’s actual sampling spread. Empirical coverage was evaluated for nominal 90%</w:t>
+        <w:t xml:space="preserve">individual realisations. The last of these asks whether the uncertainty a single calibration claims matches the estimator’s actual sampling spread. Empirical coverage was evaluated for nominal 90%</w:t>
       </w:r>
       <w:r>
         <w:t xml:space="preserve"> </w:t>
@@ -9219,13 +9242,7 @@
         <w:t xml:space="preserve"> </w:t>
       </w:r>
       <w:r>
-        <w:t xml:space="preserve">truth — so its bands carry</w:t>
-      </w:r>
-      <w:r>
-        <w:t xml:space="preserve"> </w:t>
-      </w:r>
-      <w:r>
-        <w:t xml:space="preserve">ensemble parameter uncertainty only, without the</w:t>
+        <w:t xml:space="preserve">truth and summarised by mean absolute relative error and coverage. Its bands therefore carry ensemble parameter uncertainty only, without the</w:t>
       </w:r>
       <w:r>
         <w:t xml:space="preserve"> </w:t>
@@ -9248,13 +9265,7 @@
         <w:t xml:space="preserve"> </w:t>
       </w:r>
       <w:r>
-        <w:t xml:space="preserve">term — and summarised by mean</w:t>
-      </w:r>
-      <w:r>
-        <w:t xml:space="preserve"> </w:t>
-      </w:r>
-      <w:r>
-        <w:t xml:space="preserve">absolute relative error and coverage. Finally, leave-one-zone-out was repeated under ±20%</w:t>
+        <w:t xml:space="preserve">term. Finally, leave-one-zone-out was repeated under ±20%</w:t>
       </w:r>
       <w:r>
         <w:t xml:space="preserve"> </w:t>
@@ -12884,13 +12895,7 @@
         <w:t xml:space="preserve"> </w:t>
       </w:r>
       <w:r>
-        <w:t xml:space="preserve">successor; tank level converged first, within 24 h. The three concentration criteria — a</w:t>
-      </w:r>
-      <w:r>
-        <w:t xml:space="preserve"> </w:t>
-      </w:r>
-      <w:r>
-        <w:t xml:space="preserve">cycle-to-cycle change below 0.005 mg L</w:t>
+        <w:t xml:space="preserve">successor; tank level converged first, within 24 h. The three concentration criteria were a cycle-to-cycle change below 0.005 mg L</w:t>
       </w:r>
       <w:r>
         <w:rPr>
@@ -12914,13 +12919,7 @@
         <w:t xml:space="preserve"> </w:t>
       </w:r>
       <w:r>
-        <w:t xml:space="preserve">in the network</w:t>
-      </w:r>
-      <w:r>
-        <w:t xml:space="preserve"> </w:t>
-      </w:r>
-      <w:r>
-        <w:t xml:space="preserve">95th percentile, and below 0.01 mg L</w:t>
+        <w:t xml:space="preserve">in the network 95th percentile, and below 0.01 mg L</w:t>
       </w:r>
       <w:r>
         <w:rPr>
@@ -12932,7 +12931,7 @@
         <w:t xml:space="preserve"> </w:t>
       </w:r>
       <w:r>
-        <w:t xml:space="preserve">in the tank — were all first satisfied at 120 h, which</w:t>
+        <w:t xml:space="preserve">in the tank. All three were first satisfied at 120 h, which</w:t>
       </w:r>
       <w:r>
         <w:t xml:space="preserve"> </w:t>
@@ -12958,25 +12957,49 @@
         <w:t xml:space="preserve"> </w:t>
       </w:r>
       <w:r>
-        <w:t xml:space="preserve">cumulative-deficit risk field still drifted by 5.1% between cycles against a 2% tolerance. The</w:t>
-      </w:r>
-      <w:r>
-        <w:t xml:space="preserve"> </w:t>
-      </w:r>
-      <w:r>
-        <w:t xml:space="preserve">horizon could not be extended without modifying the model, because the existing pump controls</w:t>
-      </w:r>
-      <w:r>
-        <w:t xml:space="preserve"> </w:t>
-      </w:r>
-      <w:r>
-        <w:t xml:space="preserve">are specified only within the 168 h simulation period (Appendix A). The 120 h warm-up therefore</w:t>
-      </w:r>
-      <w:r>
-        <w:t xml:space="preserve"> </w:t>
-      </w:r>
-      <w:r>
-        <w:t xml:space="preserve">provides a concentration-stable reference window for the baseline and for the tested</w:t>
+        <w:t xml:space="preserve">network-mean cumulative deficit still changed by as much as 5.1% between those cycles against a</w:t>
+      </w:r>
+      <w:r>
+        <w:t xml:space="preserve"> </w:t>
+      </w:r>
+      <w:r>
+        <w:t xml:space="preserve">2% tolerance, taken over the three parameter sets tested. That figure is a network-mean</w:t>
+      </w:r>
+      <w:r>
+        <w:t xml:space="preserve"> </w:t>
+      </w:r>
+      <w:r>
+        <w:t xml:space="preserve">severity change rather than a spatial norm, and the hotspot pattern moves with it: over the same</w:t>
+      </w:r>
+      <w:r>
+        <w:t xml:space="preserve"> </w:t>
+      </w:r>
+      <w:r>
+        <w:t xml:space="preserve">final comparison the top-10 cumulative-deficit sets at the synthetic truth had a Jaccard overlap</w:t>
+      </w:r>
+      <w:r>
+        <w:t xml:space="preserve"> </w:t>
+      </w:r>
+      <w:r>
+        <w:t xml:space="preserve">of 0.818, one node in ten differing, while the weak- and strong-reactivity corner cases were</w:t>
+      </w:r>
+      <w:r>
+        <w:t xml:space="preserve"> </w:t>
+      </w:r>
+      <w:r>
+        <w:t xml:space="preserve">stable. The horizon could not be extended without modifying the model, because the existing pump</w:t>
+      </w:r>
+      <w:r>
+        <w:t xml:space="preserve"> </w:t>
+      </w:r>
+      <w:r>
+        <w:t xml:space="preserve">controls are specified only within the 168 h simulation period (Appendix A). The 120 h warm-up</w:t>
+      </w:r>
+      <w:r>
+        <w:t xml:space="preserve"> </w:t>
+      </w:r>
+      <w:r>
+        <w:t xml:space="preserve">therefore provides a concentration-stable reference window for the baseline and for the tested</w:t>
       </w:r>
       <w:r>
         <w:t xml:space="preserve"> </w:t>
@@ -12994,19 +13017,25 @@
         <w:t xml:space="preserve"> </w:t>
       </w:r>
       <w:r>
-        <w:t xml:space="preserve">periodic steady state by 120 h. Absolute water-age values and absolute risk severities in</w:t>
-      </w:r>
-      <w:r>
-        <w:t xml:space="preserve"> </w:t>
-      </w:r>
-      <w:r>
-        <w:t xml:space="preserve">Section 3.6 accordingly inherit a residual dependence on the horizon and are used for comparison</w:t>
-      </w:r>
-      <w:r>
-        <w:t xml:space="preserve"> </w:t>
-      </w:r>
-      <w:r>
-        <w:t xml:space="preserve">between conditions rather than as calibrated magnitudes.</w:t>
+        <w:t xml:space="preserve">periodic steady state by 120 h. Parameter inference is accordingly supported by a</w:t>
+      </w:r>
+      <w:r>
+        <w:t xml:space="preserve"> </w:t>
+      </w:r>
+      <w:r>
+        <w:t xml:space="preserve">concentration-stable window, whereas absolute water-age values, absolute risk severities and</w:t>
+      </w:r>
+      <w:r>
+        <w:t xml:space="preserve"> </w:t>
+      </w:r>
+      <w:r>
+        <w:t xml:space="preserve">some hotspot-boundary decisions in Section 3.6 inherit a residual dependence on the 120–168 h</w:t>
+      </w:r>
+      <w:r>
+        <w:t xml:space="preserve"> </w:t>
+      </w:r>
+      <w:r>
+        <w:t xml:space="preserve">horizon and are used for comparison between conditions rather than as calibrated magnitudes.</w:t>
       </w:r>
     </w:p>
     <w:bookmarkEnd w:id="53"/>
@@ -13084,13 +13113,7 @@
         <w:t xml:space="preserve"> </w:t>
       </w:r>
       <w:r>
-        <w:t xml:space="preserve">aggregate residual is attainable, not that the corresponding parameter vector is correctly</w:t>
-      </w:r>
-      <w:r>
-        <w:t xml:space="preserve"> </w:t>
-      </w:r>
-      <w:r>
-        <w:t xml:space="preserve">identified — small residual differences accumulated over 294 observations may still carry</w:t>
+        <w:t xml:space="preserve">aggregate residual is attainable, not that the corresponding parameter vector is correctly identified. Small residual differences accumulated over 294 observations may still carry</w:t>
       </w:r>
       <w:r>
         <w:t xml:space="preserve"> </w:t>
@@ -13158,31 +13181,31 @@
         <w:t xml:space="preserve"> </w:t>
       </w:r>
       <w:r>
-        <w:t xml:space="preserve">the concentration Jacobian rather than relative concentration alone (Section 3.2.3). Ten of the</w:t>
-      </w:r>
-      <w:r>
-        <w:t xml:space="preserve"> </w:t>
-      </w:r>
-      <w:r>
-        <w:t xml:space="preserve">294 observations were floored at zero — six at node 15, three at node 145 and one at node 231,</w:t>
-      </w:r>
-      <w:r>
-        <w:t xml:space="preserve"> </w:t>
-      </w:r>
-      <w:r>
-        <w:t xml:space="preserve">that is nine in the old zone and one in the average zone, none in the new zone. Censoring is</w:t>
-      </w:r>
-      <w:r>
-        <w:t xml:space="preserve"> </w:t>
-      </w:r>
-      <w:r>
-        <w:t xml:space="preserve">thus concentrated in the low-residual part of the network, the region most relevant to the</w:t>
-      </w:r>
-      <w:r>
-        <w:t xml:space="preserve"> </w:t>
-      </w:r>
-      <w:r>
-        <w:t xml:space="preserve">threshold-based risk analysis that follows, and is handled explicitly in the primary likelihood.</w:t>
+        <w:t xml:space="preserve">the concentration Jacobian rather than relative concentration alone (Section 3.2.3). In the</w:t>
+      </w:r>
+      <w:r>
+        <w:t xml:space="preserve"> </w:t>
+      </w:r>
+      <w:r>
+        <w:t xml:space="preserve">reference realisation, ten of the 294 observations were floored at zero. Six of these were at node 15, three at node 145 and one at node 231, that is nine in the old zone and one in the average zone, none</w:t>
+      </w:r>
+      <w:r>
+        <w:t xml:space="preserve"> </w:t>
+      </w:r>
+      <w:r>
+        <w:t xml:space="preserve">in the new zone. Censoring is thus concentrated in the low-residual part of the network, the</w:t>
+      </w:r>
+      <w:r>
+        <w:t xml:space="preserve"> </w:t>
+      </w:r>
+      <w:r>
+        <w:t xml:space="preserve">region most relevant to the threshold-based risk analysis that follows, and is handled</w:t>
+      </w:r>
+      <w:r>
+        <w:t xml:space="preserve"> </w:t>
+      </w:r>
+      <w:r>
+        <w:t xml:space="preserve">explicitly in the primary likelihood.</w:t>
       </w:r>
     </w:p>
     <w:p>
@@ -13192,9 +13215,9 @@
       <w:r>
         <w:drawing>
           <wp:inline>
-            <wp:extent cx="4512415" cy="2282562"/>
+            <wp:extent cx="5472649" cy="2245894"/>
             <wp:effectExtent b="0" l="0" r="0" t="0"/>
-            <wp:docPr descr="Figure 1. Study system and forward baseline. (A) Net3 with pipes coloured by synthetic reaction zone, the six monitors, sources and tanks. (B) True concentration series at the monitors over the 120-168 h window (lines) with the noisy calibration observations (points). (C) Per-junction window minimum over the deterministic truth; 21 of 92 junctions fall below 0.2 mg L-1." title="" id="55" name="Picture"/>
+            <wp:docPr descr="Figure 1. Study system and forward baseline. (A) Net3 with pipes coloured by synthetic reaction zone, the six monitors, sources and tanks. (B) True concentration series at the monitors over the 120–168 h window (lines) with the noisy calibration observations (points). (C) Per-junction window minimum over the deterministic truth; 21 of 92 junctions fall below 0.2 mg L-1." title="" id="55" name="Picture"/>
             <a:graphic>
               <a:graphicData uri="http://schemas.openxmlformats.org/drawingml/2006/picture">
                 <pic:pic>
@@ -13213,7 +13236,7 @@
                   <pic:spPr bwMode="auto">
                     <a:xfrm>
                       <a:off x="0" y="0"/>
-                      <a:ext cx="4512415" cy="2282562"/>
+                      <a:ext cx="5472649" cy="2245894"/>
                     </a:xfrm>
                     <a:prstGeom prst="rect">
                       <a:avLst/>
@@ -13265,7 +13288,7 @@
         <w:t xml:space="preserve"> </w:t>
       </w:r>
       <w:r>
-        <w:t xml:space="preserve">monitors over the 120-168 h window (lines) with the noisy calibration observations (points). (C)</w:t>
+        <w:t xml:space="preserve">monitors over the 120–168 h window (lines) with the noisy calibration observations (points). (C)</w:t>
       </w:r>
       <w:r>
         <w:t xml:space="preserve"> </w:t>
@@ -14808,13 +14831,7 @@
         <w:t xml:space="preserve"> </w:t>
       </w:r>
       <w:r>
-        <w:t xml:space="preserve">almost equalled the number of retained candidates — 4783 of 4786 at a threshold of 0.107, 7062</w:t>
-      </w:r>
-      <w:r>
-        <w:t xml:space="preserve"> </w:t>
-      </w:r>
-      <w:r>
-        <w:t xml:space="preserve">of 7084 at 0.120 — so the weights were nearly uniform within the accepted set. For an iid</w:t>
+        <w:t xml:space="preserve">almost equalled the number of retained candidates, at 4783 of 4786 for a threshold of 0.107 and 7062 of 7084 at 0.120, so the weights were nearly uniform within the accepted set. For an iid</w:t>
       </w:r>
       <w:r>
         <w:t xml:space="preserve"> </w:t>
@@ -14947,30 +14964,20 @@
         <w:t xml:space="preserve"> </w:t>
       </w:r>
       <w:r>
-        <w:t xml:space="preserve">(</w:t>
+        <w:t xml:space="preserve">(Mantovan and Todini, 2006; Stedinger</w:t>
+      </w:r>
+      <w:r>
+        <w:t xml:space="preserve"> </w:t>
       </w:r>
       <w:r>
         <w:rPr>
-          <w:b/>
-          <w:bCs/>
+          <w:i/>
+          <w:iCs/>
         </w:rPr>
-        <w:t xml:space="preserve">MantovanTodini2006?</w:t>
-      </w:r>
-      <w:r>
-        <w:t xml:space="preserve">;</w:t>
-      </w:r>
-      <w:r>
-        <w:t xml:space="preserve"> </w:t>
-      </w:r>
-      <w:r>
-        <w:rPr>
-          <w:b/>
-          <w:bCs/>
-        </w:rPr>
-        <w:t xml:space="preserve">Stedinger2008?</w:t>
-      </w:r>
-      <w:r>
-        <w:t xml:space="preserve">)</w:t>
+        <w:t xml:space="preserve">et al.</w:t>
+      </w:r>
+      <w:r>
+        <w:t xml:space="preserve">, 2008)</w:t>
       </w:r>
       <w:r>
         <w:t xml:space="preserve">. The point here is narrower than the general debate over generalised likelihood</w:t>
@@ -14985,20 +14992,7 @@
         <w:t xml:space="preserve"> </w:t>
       </w:r>
       <w:r>
-        <w:t xml:space="preserve">(Beven and Binley, 1992;</w:t>
-      </w:r>
-      <w:r>
-        <w:t xml:space="preserve"> </w:t>
-      </w:r>
-      <w:r>
-        <w:rPr>
-          <w:b/>
-          <w:bCs/>
-        </w:rPr>
-        <w:t xml:space="preserve">BevenBinley2014?</w:t>
-      </w:r>
-      <w:r>
-        <w:t xml:space="preserve">)</w:t>
+        <w:t xml:space="preserve">(Beven and Binley, 1992; Beven and Binley, 2014)</w:t>
       </w:r>
       <w:r>
         <w:t xml:space="preserve">: it concerns the specific</w:t>
@@ -15067,13 +15061,7 @@
         <w:t xml:space="preserve"> </w:t>
       </w:r>
       <w:r>
-        <w:t xml:space="preserve">standard deviations fell only to 71.1%, 91.8% and 88.2% — still two to three times the formal</w:t>
-      </w:r>
-      <w:r>
-        <w:t xml:space="preserve"> </w:t>
-      </w:r>
-      <w:r>
-        <w:t xml:space="preserve">values. A cut-off discards candidates that fit badly; it cannot restore the factor</w:t>
+        <w:t xml:space="preserve">standard deviations fell only to 71.1%, 91.8% and 88.2%, still two to three times the formal values. A cut-off discards candidates that fit badly; it cannot restore the factor</w:t>
       </w:r>
       <w:r>
         <w:t xml:space="preserve"> </w:t>
@@ -15125,19 +15113,25 @@
         <w:t xml:space="preserve"> </w:t>
       </w:r>
       <w:r>
-        <w:t xml:space="preserve">and new, while retaining only 27.1%, 28.9% and 28.4% of the displaced prior’s standard deviation</w:t>
-      </w:r>
-      <w:r>
-        <w:t xml:space="preserve"> </w:t>
-      </w:r>
-      <w:r>
-        <w:t xml:space="preserve">— the same contraction as at baseline, now achieved from a starting point that no longer</w:t>
-      </w:r>
-      <w:r>
-        <w:t xml:space="preserve"> </w:t>
-      </w:r>
-      <w:r>
-        <w:t xml:space="preserve">brackets the truth. The informal comparator recovered 27.5%, 43.5% and 78.0% at a threshold of</w:t>
+        <w:t xml:space="preserve">and new, while retaining only 27.1%, 28.9% and 28.4% of the displaced prior’s standard deviation. This is the same contraction as at baseline, now achieved from a prior centred away from the truth.</w:t>
+      </w:r>
+      <w:r>
+        <w:t xml:space="preserve"> </w:t>
+      </w:r>
+      <w:r>
+        <w:t xml:space="preserve">The prior width was held fixed and each displaced box still contains the true value, so this</w:t>
+      </w:r>
+      <w:r>
+        <w:t xml:space="preserve"> </w:t>
+      </w:r>
+      <w:r>
+        <w:t xml:space="preserve">tests sensitivity to prior centring rather than recovery from a prior that excludes the truth.</w:t>
+      </w:r>
+      <w:r>
+        <w:t xml:space="preserve"> </w:t>
+      </w:r>
+      <w:r>
+        <w:t xml:space="preserve">The informal comparator recovered 27.5%, 43.5% and 78.0% at a threshold of</w:t>
       </w:r>
       <w:r>
         <w:t xml:space="preserve"> </w:t>
@@ -15333,13 +15327,7 @@
         <w:t xml:space="preserve"> </w:t>
       </w:r>
       <w:r>
-        <w:t xml:space="preserve">Cramér–Rao bound of 1.04, 1.06 and 1.12, and 90% interval coverage of 0.89, 0.88 and 0.85 —</w:t>
-      </w:r>
-      <w:r>
-        <w:t xml:space="preserve"> </w:t>
-      </w:r>
-      <w:r>
-        <w:t xml:space="preserve">close to nominal, with the new coefficient slightly under-covered.</w:t>
+        <w:t xml:space="preserve">Cramér–Rao bound of 1.04, 1.06 and 1.12, and 90% interval coverage of 0.89, 0.88 and 0.85, close to nominal, with the new coefficient slightly under-covered.</w:t>
       </w:r>
     </w:p>
     <w:p>
@@ -15351,7 +15339,7 @@
           <wp:inline>
             <wp:extent cx="5603278" cy="1682129"/>
             <wp:effectExtent b="0" l="0" r="0" t="0"/>
-            <wp:docPr descr="Figure 3. Three further diagnostics agree with the baseline result. Intervals for each coefficient from the likelihood-weighted ensemble (5-95%), continuous profile likelihood (95%), the Fisher/Cramer-Rao bound (95%) and 100 repeated-noise calibrations (mean +/- SD). Nominal levels differ by construction and are labelled individually; the four rows are not a nested comparison." title="" id="65" name="Picture"/>
+            <wp:docPr descr="Figure 3. Three further diagnostics agree with the baseline result. Intervals for each coefficient from the likelihood-weighted ensemble (5–95%), continuous profile likelihood (95%), the Fisher/Cramér–Rao bound (95%) and 100 repeated-noise calibrations (mean +/- SD). Nominal levels differ by construction and are labelled individually; the four rows are not a nested comparison." title="" id="65" name="Picture"/>
             <a:graphic>
               <a:graphicData uri="http://schemas.openxmlformats.org/drawingml/2006/picture">
                 <pic:pic>
@@ -15416,13 +15404,13 @@
         <w:t xml:space="preserve"> </w:t>
       </w:r>
       <w:r>
-        <w:t xml:space="preserve">coefficient from the likelihood-weighted ensemble (5-95%), continuous profile likelihood (95%),</w:t>
-      </w:r>
-      <w:r>
-        <w:t xml:space="preserve"> </w:t>
-      </w:r>
-      <w:r>
-        <w:t xml:space="preserve">the Fisher/Cramer-Rao bound (95%) and 100 repeated-noise calibrations (mean +/- SD). Nominal</w:t>
+        <w:t xml:space="preserve">coefficient from the likelihood-weighted ensemble (5–95%), continuous profile likelihood (95%),</w:t>
+      </w:r>
+      <w:r>
+        <w:t xml:space="preserve"> </w:t>
+      </w:r>
+      <w:r>
+        <w:t xml:space="preserve">the Fisher/Cramér–Rao bound (95%) and 100 repeated-noise calibrations (mean +/- SD). Nominal</w:t>
       </w:r>
       <w:r>
         <w:t xml:space="preserve"> </w:t>
@@ -15460,30 +15448,20 @@
         <w:t xml:space="preserve"> </w:t>
       </w:r>
       <w:r>
-        <w:t xml:space="preserve">(</w:t>
+        <w:t xml:space="preserve">(Brun, Reichert and Künsch, 2001; Raue</w:t>
+      </w:r>
+      <w:r>
+        <w:t xml:space="preserve"> </w:t>
       </w:r>
       <w:r>
         <w:rPr>
-          <w:b/>
-          <w:bCs/>
+          <w:i/>
+          <w:iCs/>
         </w:rPr>
-        <w:t xml:space="preserve">Brun2001?</w:t>
-      </w:r>
-      <w:r>
-        <w:t xml:space="preserve">;</w:t>
-      </w:r>
-      <w:r>
-        <w:t xml:space="preserve"> </w:t>
-      </w:r>
-      <w:r>
-        <w:rPr>
-          <w:b/>
-          <w:bCs/>
-        </w:rPr>
-        <w:t xml:space="preserve">Raue2009?</w:t>
-      </w:r>
-      <w:r>
-        <w:t xml:space="preserve">)</w:t>
+        <w:t xml:space="preserve">et al.</w:t>
+      </w:r>
+      <w:r>
+        <w:t xml:space="preserve">, 2009)</w:t>
       </w:r>
       <w:r>
         <w:t xml:space="preserve">.</w:t>
@@ -15623,7 +15601,7 @@
         <w:t xml:space="preserve"> </w:t>
       </w:r>
       <w:r>
-        <w:t xml:space="preserve">rather than a demonstrated sensor specification — at 0.10 mg L</w:t>
+        <w:t xml:space="preserve">rather than a demonstrated sensor specification. At 0.10 mg L</w:t>
       </w:r>
       <w:r>
         <w:rPr>
@@ -15635,13 +15613,7 @@
         <w:t xml:space="preserve"> </w:t>
       </w:r>
       <w:r>
-        <w:t xml:space="preserve">it returned standard</w:t>
-      </w:r>
-      <w:r>
-        <w:t xml:space="preserve"> </w:t>
-      </w:r>
-      <w:r>
-        <w:t xml:space="preserve">deviations 2.4 to 3.1 times the formal ones. The converse benefit cannot be quantified here: at</w:t>
+        <w:t xml:space="preserve">it returned standard deviations 2.4 to 3.1 times the formal ones. The converse benefit cannot be quantified here: at</w:t>
       </w:r>
       <w:r>
         <w:t xml:space="preserve"> </w:t>
@@ -15757,19 +15729,7 @@
         <w:t xml:space="preserve"> </w:t>
       </w:r>
       <w:r>
-        <w:t xml:space="preserve">coefficients rather than represented. The response is asymmetric in sign — the same offsets</w:t>
-      </w:r>
-      <w:r>
-        <w:t xml:space="preserve"> </w:t>
-      </w:r>
-      <w:r>
-        <w:t xml:space="preserve">negative gave 2.59 and 3.82 — because a downward bias pushes more readings onto the censoring</w:t>
-      </w:r>
-      <w:r>
-        <w:t xml:space="preserve"> </w:t>
-      </w:r>
-      <w:r>
-        <w:t xml:space="preserve">floor.</w:t>
+        <w:t xml:space="preserve">coefficients rather than represented. The response is asymmetric in sign, because a downward bias pushes more readings onto the censoring floor. The same offsets applied negatively gave 2.59 and 3.82.</w:t>
       </w:r>
     </w:p>
     <w:p>
@@ -15804,13 +15764,7 @@
         <w:t xml:space="preserve"> </w:t>
       </w:r>
       <w:r>
-        <w:t xml:space="preserve">new (node 113, −0.10). Contamination crosses zone boundaries — a −0.10 offset at new-zone node</w:t>
-      </w:r>
-      <w:r>
-        <w:t xml:space="preserve"> </w:t>
-      </w:r>
-      <w:r>
-        <w:t xml:space="preserve">107 displaced the average coefficient by 1.59. Per-arm results are in Appendix F.</w:t>
+        <w:t xml:space="preserve">new (node 113, −0.10). Contamination crosses zone boundaries. A −0.10 offset at new-zone node 107 displaced the average coefficient by 1.59. Per-arm results are in Appendix F.</w:t>
       </w:r>
     </w:p>
     <w:p>
@@ -15842,25 +15796,37 @@
         <w:t xml:space="preserve"> </w:t>
       </w:r>
       <w:r>
-        <w:t xml:space="preserve">behaves much more like a constant +0.05 than a constant +0.10. By comparison the ten censored</w:t>
-      </w:r>
-      <w:r>
-        <w:t xml:space="preserve"> </w:t>
-      </w:r>
-      <w:r>
-        <w:t xml:space="preserve">readings are a small correction — treating them as exact zeros moves the old coefficient by 0.12</w:t>
-      </w:r>
-      <w:r>
-        <w:t xml:space="preserve"> </w:t>
-      </w:r>
-      <w:r>
-        <w:t xml:space="preserve">standard deviations and the others by less than 0.01, leaving the top-three risk ranking</w:t>
-      </w:r>
-      <w:r>
-        <w:t xml:space="preserve"> </w:t>
-      </w:r>
-      <w:r>
-        <w:t xml:space="preserve">unchanged.</w:t>
+        <w:t xml:space="preserve">behaves much more like a constant +0.05 than a constant +0.10. By comparison the censored</w:t>
+      </w:r>
+      <w:r>
+        <w:t xml:space="preserve"> </w:t>
+      </w:r>
+      <w:r>
+        <w:t xml:space="preserve">readings are a small correction. Across 30 independent noise realisations, treating them as</w:t>
+      </w:r>
+      <w:r>
+        <w:t xml:space="preserve"> </w:t>
+      </w:r>
+      <w:r>
+        <w:t xml:space="preserve">exact zeros rather than as left-censored moves the old coefficient by a median of 0.11 baseline</w:t>
+      </w:r>
+      <w:r>
+        <w:t xml:space="preserve"> </w:t>
+      </w:r>
+      <w:r>
+        <w:t xml:space="preserve">posterior standard deviations and the other two by less than 0.01, leaving the top-three risk</w:t>
+      </w:r>
+      <w:r>
+        <w:t xml:space="preserve"> </w:t>
+      </w:r>
+      <w:r>
+        <w:t xml:space="preserve">ranking unchanged. The count of ten floored readings quoted in Section 3.1.3 censuses the</w:t>
+      </w:r>
+      <w:r>
+        <w:t xml:space="preserve"> </w:t>
+      </w:r>
+      <w:r>
+        <w:t xml:space="preserve">reference realisation; the displacement is a median over the thirty.</w:t>
       </w:r>
     </w:p>
     <w:bookmarkEnd w:id="70"/>
@@ -15958,19 +15924,7 @@
         <w:t xml:space="preserve"> </w:t>
       </w:r>
       <w:r>
-        <w:t xml:space="preserve">identifiable from this six-monitor design once both bulk decay and monitor offsets are treated</w:t>
-      </w:r>
-      <w:r>
-        <w:t xml:space="preserve"> </w:t>
-      </w:r>
-      <w:r>
-        <w:t xml:space="preserve">as unknown — a statement about this observation design and nuisance model, not a mathematical</w:t>
-      </w:r>
-      <w:r>
-        <w:t xml:space="preserve"> </w:t>
-      </w:r>
-      <w:r>
-        <w:t xml:space="preserve">impossibility. This is the formal counterpart of Section 3.3.2: the available concentration</w:t>
+        <w:t xml:space="preserve">identifiable from this six-monitor design once both bulk decay and monitor offsets are treated as unknown. This is a statement about this observation design and nuisance model, not a mathematical impossibility. This is the formal counterpart of Section 3.3.2: the available concentration</w:t>
       </w:r>
       <w:r>
         <w:t xml:space="preserve"> </w:t>
@@ -16024,9 +15978,9 @@
       <w:r>
         <w:drawing>
           <wp:inline>
-            <wp:extent cx="5753100" cy="994694"/>
+            <wp:extent cx="5753100" cy="664713"/>
             <wp:effectExtent b="0" l="0" r="0" t="0"/>
-            <wp:docPr descr="Figure 4. Standardised effect of each error source. (A) Interval widening where an uncertainty source is represented in the model. (B) Displacement where a perturbation is imposed but not represented, in baseline posterior standard deviations — the median within-realisation value over the 30 unbiased realisations, not the single-realisation value of Table 3. The panels answer different questions and are not comparable; sign is printed, not encoded by colour." title="" id="72" name="Picture"/>
+            <wp:docPr descr="Figure 4. Standardised effect of each error source. (A) Interval widening where an uncertainty source is represented in the model. (B) Displacement where a perturbation is imposed but not represented, in baseline posterior standard deviations. This is the median within-realisation value over the 30 unbiased realisations, not the single-realisation value of Table 3. The panels answer different questions and are not comparable; sign is printed, not encoded by colour." title="" id="72" name="Picture"/>
             <a:graphic>
               <a:graphicData uri="http://schemas.openxmlformats.org/drawingml/2006/picture">
                 <pic:pic>
@@ -16045,7 +15999,7 @@
                   <pic:spPr bwMode="auto">
                     <a:xfrm>
                       <a:off x="0" y="0"/>
-                      <a:ext cx="5753100" cy="994694"/>
+                      <a:ext cx="5753100" cy="664713"/>
                     </a:xfrm>
                     <a:prstGeom prst="rect">
                       <a:avLst/>
@@ -16097,13 +16051,7 @@
         <w:t xml:space="preserve"> </w:t>
       </w:r>
       <w:r>
-        <w:t xml:space="preserve">but not represented, in baseline posterior standard deviations — the median within-realisation</w:t>
-      </w:r>
-      <w:r>
-        <w:t xml:space="preserve"> </w:t>
-      </w:r>
-      <w:r>
-        <w:t xml:space="preserve">value over the 30 unbiased realisations, not the single-realisation value of Table 3. The panels</w:t>
+        <w:t xml:space="preserve">but not represented, in baseline posterior standard deviations. This is the median within-realisation value over the 30 unbiased realisations, not the single-realisation value of Table 3. The panels</w:t>
       </w:r>
       <w:r>
         <w:t xml:space="preserve"> </w:t>
@@ -16499,7 +16447,7 @@
               <w:pStyle w:val="Compact"/>
             </w:pPr>
             <w:r>
-              <w:t xml:space="preserve">sensor bias, worst arm (D)</w:t>
+              <w:t xml:space="preserve">sensor bias, max over arms (D)</w:t>
             </w:r>
           </w:p>
         </w:tc>
@@ -16557,7 +16505,7 @@
               <w:pStyle w:val="Compact"/>
             </w:pPr>
             <w:r>
-              <w:t xml:space="preserve">24 arms x 30</w:t>
+              <w:t xml:space="preserve">24 arms x 30; max taken per coefficient</w:t>
             </w:r>
           </w:p>
         </w:tc>
@@ -16691,7 +16639,7 @@
               <w:pStyle w:val="Compact"/>
             </w:pPr>
             <w:r>
-              <w:t xml:space="preserve">10/294 clipped</w:t>
+              <w:t xml:space="preserve">30 real.; reference seed has 10/294 clipped</w:t>
             </w:r>
           </w:p>
         </w:tc>
@@ -17047,13 +16995,7 @@
         <w:t xml:space="preserve"> </w:t>
       </w:r>
       <w:r>
-        <w:t xml:space="preserve">independent fields at +/-20%, the structural increment — the shift relative to a homogeneous</w:t>
-      </w:r>
-      <w:r>
-        <w:t xml:space="preserve"> </w:t>
-      </w:r>
-      <w:r>
-        <w:t xml:space="preserve">control run with the same noise — was +0.011 +/- 0.033 m day</w:t>
+        <w:t xml:space="preserve">independent fields at +/-20%, the structural increment, defined as the shift relative to a homogeneous control run with the same noise, was +0.011 +/- 0.033 m day</w:t>
       </w:r>
       <w:r>
         <w:rPr>
@@ -17115,13 +17057,7 @@
         <w:t xml:space="preserve"> </w:t>
       </w:r>
       <w:r>
-        <w:t xml:space="preserve">heterogeneity, and the best achievable fit stays at the noise floor. Nor would one field have</w:t>
-      </w:r>
-      <w:r>
-        <w:t xml:space="preserve"> </w:t>
-      </w:r>
-      <w:r>
-        <w:t xml:space="preserve">sufficed — the realisation examined first gave an old-zone increment of −0.032 m day</w:t>
+        <w:t xml:space="preserve">heterogeneity, and the best achievable fit stays at the noise floor. Nor would one field have sufficed. The realisation examined first gave an old-zone increment of −0.032 m day</w:t>
       </w:r>
       <w:r>
         <w:rPr>
@@ -17236,19 +17172,7 @@
         <w:t xml:space="preserve"> </w:t>
       </w:r>
       <w:r>
-        <w:t xml:space="preserve">gives displacements of −1.55, −1.89 and −1.65 baseline posterior standard deviations for old,</w:t>
-      </w:r>
-      <w:r>
-        <w:t xml:space="preserve"> </w:t>
-      </w:r>
-      <w:r>
-        <w:t xml:space="preserve">average and new — comparable in magnitude across all three coefficients — while the fit remains</w:t>
-      </w:r>
-      <w:r>
-        <w:t xml:space="preserve"> </w:t>
-      </w:r>
-      <w:r>
-        <w:t xml:space="preserve">at the noise floor, with a best RMSE of 0.0968 against a realised noise RMSE of 0.0973.</w:t>
+        <w:t xml:space="preserve">gives displacements of −1.55, −1.89 and −1.65 baseline posterior standard deviations for old, average and new, comparable in magnitude across all three coefficients, while the fit remains at the noise floor, with a best RMSE of 0.0968 against a realised noise RMSE of 0.0973.</w:t>
       </w:r>
     </w:p>
     <w:p>
@@ -17338,13 +17262,7 @@
         <w:t xml:space="preserve"> </w:t>
       </w:r>
       <w:r>
-        <w:t xml:space="preserve">5th-to-95th ranges are wide and overlap heavily across zones — [0.12, 1.46] for old, [−0.07,</w:t>
-      </w:r>
-      <w:r>
-        <w:t xml:space="preserve"> </w:t>
-      </w:r>
-      <w:r>
-        <w:t xml:space="preserve">2.43] for average and [−0.03, 1.78] for new — and all three contain unity, so the coefficients</w:t>
+        <w:t xml:space="preserve">5th-to-95th ranges are wide and overlap heavily across zones, at [0.12, 1.46] for old, [−0.07, 2.43] for average and [−0.03, 1.78] for new. All three contain unity, so the coefficients</w:t>
       </w:r>
       <w:r>
         <w:t xml:space="preserve"> </w:t>
@@ -17425,19 +17343,7 @@
         </m:r>
       </m:oMath>
       <w:r>
-        <w:t xml:space="preserve">, 0.50 and 0.75, against</w:t>
-      </w:r>
-      <w:r>
-        <w:t xml:space="preserve"> </w:t>
-      </w:r>
-      <w:r>
-        <w:t xml:space="preserve">formal medians of 1.10, 0.86 and 0.74 — between 0.46 and 0.59 of the formal value at every</w:t>
-      </w:r>
-      <w:r>
-        <w:t xml:space="preserve"> </w:t>
-      </w:r>
-      <w:r>
-        <w:t xml:space="preserve">strength. Both rules report a falling fraction as</w:t>
+        <w:t xml:space="preserve">, 0.50 and 0.75, against formal medians of 1.10, 0.86 and 0.74, that is between 0.46 and 0.59 of the formal value at every strength. Both rules report a falling fraction as</w:t>
       </w:r>
       <w:r>
         <w:t xml:space="preserve"> </w:t>
@@ -17555,13 +17461,7 @@
         <w:t xml:space="preserve"> </w:t>
       </w:r>
       <w:r>
-        <w:t xml:space="preserve">source is the grouped model rather than the observation process — though better instruments</w:t>
-      </w:r>
-      <w:r>
-        <w:t xml:space="preserve"> </w:t>
-      </w:r>
-      <w:r>
-        <w:t xml:space="preserve">would make it easier to detect.</w:t>
+        <w:t xml:space="preserve">source is the grouped model rather than the observation process, though better instruments would make it easier to detect.</w:t>
       </w:r>
     </w:p>
     <w:p>
@@ -17573,7 +17473,7 @@
           <wp:inline>
             <wp:extent cx="5753100" cy="1462293"/>
             <wp:effectExtent b="0" l="0" r="0" t="0"/>
-            <wp:docPr descr="Figure 5. Symmetric and structured within-zone heterogeneity. (A) Structural increment over 25 independent +/-20% fields, in baseline posterior standard deviations. (B) One field against the 25-field mean, showing sign reversal. (C) Raw arithmetic-to-proxy displacement fraction: median and 5-95% range over 30 noise realisations; the faint marker is the paired reference realisation whose control-adjusted shift is quoted in the text. (D) Structural residual against the largest standardised displacement — descriptive across designs, not equivalent replication schemes." title="" id="79" name="Picture"/>
+            <wp:docPr descr="Figure 5. Symmetric and structured within-zone heterogeneity. (A) Structural increment over 25 independent +/-20% fields, in baseline posterior standard deviations. (B) One field against the 25-field mean, showing sign reversal. (C) Raw arithmetic-to-proxy displacement fraction f_j: squares and bars are the median and 5–95% range over 30 noise realisations, without the paired control adjustment; the faint open marker above each bar is the single reference realisation, which is control-adjusted and is shown only to indicate that the spread across draws is real. The two are different quantities and are not directly comparable. (D) Structural residual against the largest standardised displacement, shown descriptively across designs rather than as equivalent replication schemes." title="" id="79" name="Picture"/>
             <a:graphic>
               <a:graphicData uri="http://schemas.openxmlformats.org/drawingml/2006/picture">
                 <pic:pic>
@@ -17650,25 +17550,51 @@
         <w:t xml:space="preserve"> </w:t>
       </w:r>
       <w:r>
-        <w:t xml:space="preserve">fraction: median and 5-95% range over 30 noise realisations; the faint marker is the paired</w:t>
-      </w:r>
-      <w:r>
-        <w:t xml:space="preserve"> </w:t>
-      </w:r>
-      <w:r>
-        <w:t xml:space="preserve">reference realisation whose control-adjusted shift is quoted in the text. (D) Structural</w:t>
-      </w:r>
-      <w:r>
-        <w:t xml:space="preserve"> </w:t>
-      </w:r>
-      <w:r>
-        <w:t xml:space="preserve">residual against the largest standardised displacement — descriptive across designs, not</w:t>
-      </w:r>
-      <w:r>
-        <w:t xml:space="preserve"> </w:t>
-      </w:r>
-      <w:r>
-        <w:t xml:space="preserve">equivalent replication schemes.</w:t>
+        <w:t xml:space="preserve">fraction</w:t>
+      </w:r>
+      <w:r>
+        <w:t xml:space="preserve"> </w:t>
+      </w:r>
+      <m:oMath>
+        <m:sSub>
+          <m:e>
+            <m:r>
+              <m:t>f</m:t>
+            </m:r>
+          </m:e>
+          <m:sub>
+            <m:r>
+              <m:t>j</m:t>
+            </m:r>
+          </m:sub>
+        </m:sSub>
+      </m:oMath>
+      <w:r>
+        <w:t xml:space="preserve">: squares and bars are the median and 5–95% range over 30 noise realisations,</w:t>
+      </w:r>
+      <w:r>
+        <w:t xml:space="preserve"> </w:t>
+      </w:r>
+      <w:r>
+        <w:t xml:space="preserve">without the paired control adjustment; the faint open marker above each bar is the single</w:t>
+      </w:r>
+      <w:r>
+        <w:t xml:space="preserve"> </w:t>
+      </w:r>
+      <w:r>
+        <w:t xml:space="preserve">reference realisation, which is control-adjusted and is shown only to indicate that the spread</w:t>
+      </w:r>
+      <w:r>
+        <w:t xml:space="preserve"> </w:t>
+      </w:r>
+      <w:r>
+        <w:t xml:space="preserve">across draws is real. The two are different quantities and are not directly comparable.</w:t>
+      </w:r>
+      <w:r>
+        <w:t xml:space="preserve"> </w:t>
+      </w:r>
+      <w:r>
+        <w:t xml:space="preserve">(D) Structural residual against the largest standardised displacement, shown descriptively across designs rather than as equivalent replication schemes.</w:t>
       </w:r>
     </w:p>
     <w:bookmarkEnd w:id="81"/>
@@ -17853,13 +17779,7 @@
         <w:pStyle w:val="BodyText"/>
       </w:pPr>
       <w:r>
-        <w:t xml:space="preserve">Predictive performance barely notices. Held-out RMSE at the dropped monitors is 0.0999, 0.0988</w:t>
-      </w:r>
-      <w:r>
-        <w:t xml:space="preserve"> </w:t>
-      </w:r>
-      <w:r>
-        <w:t xml:space="preserve">and 0.1006 mg L</w:t>
+        <w:t xml:space="preserve">Predictive performance barely notices. Held-out RMSE at the dropped monitors is 0.0999, 0.0988 and 0.1006 mg L</w:t>
       </w:r>
       <w:r>
         <w:rPr>
@@ -17868,16 +17788,7 @@
         <w:t xml:space="preserve">-1</w:t>
       </w:r>
       <w:r>
-        <w:t xml:space="preserve"> </w:t>
-      </w:r>
-      <w:r>
-        <w:t xml:space="preserve">— comparable to the leave-one-monitor-out values and to the</w:t>
-      </w:r>
-      <w:r>
-        <w:t xml:space="preserve"> </w:t>
-      </w:r>
-      <w:r>
-        <w:t xml:space="preserve">observation-noise scale — with coverage between 0.90 and 0.96 (Figure 6). Repeating</w:t>
+        <w:t xml:space="preserve">, comparable to the leave-one-monitor-out values and to the observation-noise scale, with coverage between 0.90 and 0.96 (Figure 6). Repeating</w:t>
       </w:r>
       <w:r>
         <w:t xml:space="preserve"> </w:t>
@@ -17916,13 +17827,75 @@
         <w:t xml:space="preserve"> </w:t>
       </w:r>
       <w:r>
-        <w:t xml:space="preserve">entered any calibration had a median mean-absolute relative error of 0.8% under the primary</w:t>
-      </w:r>
-      <w:r>
-        <w:t xml:space="preserve"> </w:t>
-      </w:r>
-      <w:r>
-        <w:t xml:space="preserve">likelihood.</w:t>
+        <w:t xml:space="preserve">entered any calibration had a median mean-absolute relative error of 0.83% under the primary</w:t>
+      </w:r>
+      <w:r>
+        <w:t xml:space="preserve"> </w:t>
+      </w:r>
+      <w:r>
+        <w:t xml:space="preserve">likelihood, with an interquartile range of 0.41% to 1.45% across junctions and noise</w:t>
+      </w:r>
+      <w:r>
+        <w:t xml:space="preserve"> </w:t>
+      </w:r>
+      <w:r>
+        <w:t xml:space="preserve">realisations; the median is well inside one per cent but the upper quartile is not.</w:t>
+      </w:r>
+    </w:p>
+    <w:p>
+      <w:pPr>
+        <w:pStyle w:val="BodyText"/>
+      </w:pPr>
+      <w:r>
+        <w:t xml:space="preserve">The predictive bands at those same junctions are a less flattering result and are reported here</w:t>
+      </w:r>
+      <w:r>
+        <w:t xml:space="preserve"> </w:t>
+      </w:r>
+      <w:r>
+        <w:t xml:space="preserve">for that reason. Against a nominal 90%, the median pointwise coverage was 1.00 for both the</w:t>
+      </w:r>
+      <w:r>
+        <w:t xml:space="preserve"> </w:t>
+      </w:r>
+      <w:r>
+        <w:t xml:space="preserve">normal-approximation and the weighted-quantile band, under the formal rule as well as the</w:t>
+      </w:r>
+      <w:r>
+        <w:t xml:space="preserve"> </w:t>
+      </w:r>
+      <w:r>
+        <w:t xml:space="preserve">informal comparator. That is over-coverage: the bands are conservative rather than calibrated,</w:t>
+      </w:r>
+      <w:r>
+        <w:t xml:space="preserve"> </w:t>
+      </w:r>
+      <w:r>
+        <w:t xml:space="preserve">which is exactly what an inflated parameter spread produces, and it is flattered further because</w:t>
+      </w:r>
+      <w:r>
+        <w:t xml:space="preserve"> </w:t>
+      </w:r>
+      <w:r>
+        <w:t xml:space="preserve">the targets were generated by the same hydraulic and reaction model that produced the</w:t>
+      </w:r>
+      <w:r>
+        <w:t xml:space="preserve"> </w:t>
+      </w:r>
+      <w:r>
+        <w:t xml:space="preserve">predictions. Coverage at these junctions therefore does not establish that the reported</w:t>
+      </w:r>
+      <w:r>
+        <w:t xml:space="preserve"> </w:t>
+      </w:r>
+      <w:r>
+        <w:t xml:space="preserve">uncertainty is correctly sized, and the same caution applies to the nominally well-calibrated</w:t>
+      </w:r>
+      <w:r>
+        <w:t xml:space="preserve"> </w:t>
+      </w:r>
+      <w:r>
+        <w:t xml:space="preserve">coverage of the held-out monitor designs.</w:t>
       </w:r>
     </w:p>
     <w:p>
@@ -18026,13 +17999,7 @@
         <w:t xml:space="preserve"> </w:t>
       </w:r>
       <w:r>
-        <w:t xml:space="preserve">intervention whose design depends on which zone is reactive — for those, Section 3.5.2 shows the</w:t>
-      </w:r>
-      <w:r>
-        <w:t xml:space="preserve"> </w:t>
-      </w:r>
-      <w:r>
-        <w:t xml:space="preserve">evidence may be absent while every predictive diagnostic passes. A model adequate for</w:t>
+        <w:t xml:space="preserve">intervention whose design depends on which zone is reactive. For those, Section 3.5.2 shows the evidence may be absent while every predictive diagnostic passes. A model adequate for</w:t>
       </w:r>
       <w:r>
         <w:t xml:space="preserve"> </w:t>
@@ -18074,7 +18041,7 @@
       <w:r>
         <w:drawing>
           <wp:inline>
-            <wp:extent cx="5591819" cy="2500276"/>
+            <wp:extent cx="5753100" cy="2077667"/>
             <wp:effectExtent b="0" l="0" r="0" t="0"/>
             <wp:docPr descr="Figure 6. A zone coefficient can remain at its prior while prediction stays near the noise scale. For each withheld zone: the median inferred coefficient over 30 realisations, with a 90% width from the median within-realisation posterior standard deviation, against prior support, prior midpoint and truth; the label gives that standard deviation as a fraction of the prior. Right: held-out RMSE at the dropped monitors against the noise level." title="" id="86" name="Picture"/>
             <a:graphic>
@@ -18095,7 +18062,7 @@
                   <pic:spPr bwMode="auto">
                     <a:xfrm>
                       <a:off x="0" y="0"/>
-                      <a:ext cx="5591819" cy="2500276"/>
+                      <a:ext cx="5753100" cy="2077667"/>
                     </a:xfrm>
                     <a:prstGeom prst="rect">
                       <a:avLst/>
@@ -19254,13 +19221,7 @@
         <w:t xml:space="preserve"> </w:t>
       </w:r>
       <w:r>
-        <w:t xml:space="preserve">one another in expected breach fraction, but bulk-decay misspecification also produces deeper</w:t>
-      </w:r>
-      <w:r>
-        <w:t xml:space="preserve"> </w:t>
-      </w:r>
-      <w:r>
-        <w:t xml:space="preserve">reordering — one node moves from third to eighth and another from fourth to twentieth when bulk</w:t>
+        <w:t xml:space="preserve">one another in expected breach fraction, but bulk-decay misspecification also produces deeper reordering. One node moves from third to eighth and another from fourth to twentieth when bulk</w:t>
       </w:r>
       <w:r>
         <w:t xml:space="preserve"> </w:t>
@@ -19385,19 +19346,7 @@
         <w:t xml:space="preserve"> </w:t>
       </w:r>
       <w:r>
-        <w:t xml:space="preserve">h. Adding illustrative zone-specific ageing multipliers at 20 degrees —</w:t>
-      </w:r>
-      <w:r>
-        <w:t xml:space="preserve"> </w:t>
-      </w:r>
-      <w:r>
-        <w:t xml:space="preserve">1.35 for the average zone and 1.85 for the old zone, with the new zone unchanged — raises these</w:t>
-      </w:r>
-      <w:r>
-        <w:t xml:space="preserve"> </w:t>
-      </w:r>
-      <w:r>
-        <w:t xml:space="preserve">to 31 junctions, 69.4 L s</w:t>
+        <w:t xml:space="preserve">h. Adding illustrative zone-specific ageing multipliers at 20 degrees, 1.35 for the average zone and 1.85 for the old zone with the new zone unchanged, raises these to 31 junctions, 69.4 L s</w:t>
       </w:r>
       <w:r>
         <w:rPr>
@@ -20065,19 +20014,7 @@
         <w:t xml:space="preserve"> </w:t>
       </w:r>
       <w:r>
-        <w:t xml:space="preserve">tested, and the effective weighting the fit estimates was not identified. Hydraulic uncertainty</w:t>
-      </w:r>
-      <w:r>
-        <w:t xml:space="preserve"> </w:t>
-      </w:r>
-      <w:r>
-        <w:t xml:space="preserve">was not propagated at all — demands, roughness, controls and the flow field were treated as</w:t>
-      </w:r>
-      <w:r>
-        <w:t xml:space="preserve"> </w:t>
-      </w:r>
-      <w:r>
-        <w:t xml:space="preserve">known — so the identifiability reported here is likely optimistic relative to a field</w:t>
+        <w:t xml:space="preserve">tested, and the effective weighting the fit estimates was not identified. Hydraulic uncertainty was not propagated at all, because demands, roughness, controls and the flow field were treated as known. The identifiability reported here is therefore likely optimistic relative to a field</w:t>
       </w:r>
       <w:r>
         <w:t xml:space="preserve"> </w:t>
@@ -20191,13 +20128,7 @@
         <w:t xml:space="preserve"> </w:t>
       </w:r>
       <w:r>
-        <w:t xml:space="preserve">drift as hierarchical nuisance parameters, and an estimated rather than assumed error covariance</w:t>
-      </w:r>
-      <w:r>
-        <w:t xml:space="preserve"> </w:t>
-      </w:r>
-      <w:r>
-        <w:t xml:space="preserve">— costly in precision, but honest about it. A likelihood-adapted sampler would remove the</w:t>
+        <w:t xml:space="preserve">drift as hierarchical nuisance parameters, and an estimated rather than assumed error covariance, which is costly in precision but honest about it. A likelihood-adapted sampler would remove the</w:t>
       </w:r>
       <w:r>
         <w:t xml:space="preserve"> </w:t>
@@ -20315,31 +20246,43 @@
         <w:t xml:space="preserve"> </w:t>
       </w:r>
       <w:r>
-        <w:t xml:space="preserve">posterior standard deviations while the fit remains at the noise floor, so neither is detectable</w:t>
-      </w:r>
-      <w:r>
-        <w:t xml:space="preserve"> </w:t>
-      </w:r>
-      <w:r>
-        <w:t xml:space="preserve">from goodness of fit. Bulk-decay uncertainty does both and falls disproportionately on the two</w:t>
-      </w:r>
-      <w:r>
-        <w:t xml:space="preserve"> </w:t>
-      </w:r>
-      <w:r>
-        <w:t xml:space="preserve">weakly decaying zones; once bulk decay and monitor-specific offsets are treated as unknown</w:t>
-      </w:r>
-      <w:r>
-        <w:t xml:space="preserve"> </w:t>
-      </w:r>
-      <w:r>
-        <w:t xml:space="preserve">together, those two coefficients are no longer practically identifiable from this six-monitor</w:t>
-      </w:r>
-      <w:r>
-        <w:t xml:space="preserve"> </w:t>
-      </w:r>
-      <w:r>
-        <w:t xml:space="preserve">design. Structured heterogeneity displaced all three coefficients comparably, although the zones</w:t>
+        <w:t xml:space="preserve">posterior standard deviations while aggregate fit remains at the noise floor, so in the cases</w:t>
+      </w:r>
+      <w:r>
+        <w:t xml:space="preserve"> </w:t>
+      </w:r>
+      <w:r>
+        <w:t xml:space="preserve">tested here neither was revealed by the aggregate residual statistic used. Bulk-decay</w:t>
+      </w:r>
+      <w:r>
+        <w:t xml:space="preserve"> </w:t>
+      </w:r>
+      <w:r>
+        <w:t xml:space="preserve">uncertainty does both and falls disproportionately on the two weakly decaying zones; under the</w:t>
+      </w:r>
+      <w:r>
+        <w:t xml:space="preserve"> </w:t>
+      </w:r>
+      <w:r>
+        <w:t xml:space="preserve">local Fisher analysis and the study-specific criterion that the Cramér–Rao bound stay below the</w:t>
+      </w:r>
+      <w:r>
+        <w:t xml:space="preserve"> </w:t>
+      </w:r>
+      <w:r>
+        <w:t xml:space="preserve">prior standard deviation, those two coefficients cease to be practically identifiable from this</w:t>
+      </w:r>
+      <w:r>
+        <w:t xml:space="preserve"> </w:t>
+      </w:r>
+      <w:r>
+        <w:t xml:space="preserve">six-monitor design once bulk decay and monitor-specific offsets are treated as unknown together.</w:t>
+      </w:r>
+      <w:r>
+        <w:t xml:space="preserve"> </w:t>
+      </w:r>
+      <w:r>
+        <w:t xml:space="preserve">Structured heterogeneity displaced all three coefficients comparably, although the zones</w:t>
       </w:r>
       <w:r>
         <w:t xml:space="preserve"> </w:t>
@@ -20371,25 +20314,43 @@
         <w:t xml:space="preserve"> </w:t>
       </w:r>
       <w:r>
-        <w:t xml:space="preserve">recovery. When a zone’s monitors were withheld, its coefficient returned to the prior midpoint</w:t>
-      </w:r>
-      <w:r>
-        <w:t xml:space="preserve"> </w:t>
-      </w:r>
-      <w:r>
-        <w:t xml:space="preserve">and retained the full prior standard deviation, yet held-out prediction at those same monitors</w:t>
-      </w:r>
-      <w:r>
-        <w:t xml:space="preserve"> </w:t>
-      </w:r>
-      <w:r>
-        <w:t xml:space="preserve">stayed at the observation-noise scale, and errors at never-calibrated junctions remained below</w:t>
-      </w:r>
-      <w:r>
-        <w:t xml:space="preserve"> </w:t>
-      </w:r>
-      <w:r>
-        <w:t xml:space="preserve">about one per cent. Parameter displacements of several standard deviations left whole-network</w:t>
+        <w:t xml:space="preserve">recovery. When a zone’s monitors were withheld, the old- and average-zone coefficients returned</w:t>
+      </w:r>
+      <w:r>
+        <w:t xml:space="preserve"> </w:t>
+      </w:r>
+      <w:r>
+        <w:t xml:space="preserve">to their prior midpoints and retained essentially the whole prior standard deviation, while the</w:t>
+      </w:r>
+      <w:r>
+        <w:t xml:space="preserve"> </w:t>
+      </w:r>
+      <w:r>
+        <w:t xml:space="preserve">new-zone coefficient stayed partly constrained by the remaining monitors and retained 57% of it.</w:t>
+      </w:r>
+      <w:r>
+        <w:t xml:space="preserve"> </w:t>
+      </w:r>
+      <w:r>
+        <w:t xml:space="preserve">In all three cases held-out prediction at those same monitors stayed at the observation-noise</w:t>
+      </w:r>
+      <w:r>
+        <w:t xml:space="preserve"> </w:t>
+      </w:r>
+      <w:r>
+        <w:t xml:space="preserve">scale, and across the 20 never-calibrated junctions and 30 noise realisations the median</w:t>
+      </w:r>
+      <w:r>
+        <w:t xml:space="preserve"> </w:t>
+      </w:r>
+      <w:r>
+        <w:t xml:space="preserve">node-level mean absolute relative error was 0.83%, with an interquartile range of 0.41–1.45%.</w:t>
+      </w:r>
+      <w:r>
+        <w:t xml:space="preserve"> </w:t>
+      </w:r>
+      <w:r>
+        <w:t xml:space="preserve">Parameter displacements of several standard deviations left whole-network</w:t>
       </w:r>
       <w:r>
         <w:t xml:space="preserve"> </w:t>
@@ -20461,41 +20422,17 @@
       </w:r>
     </w:p>
     <w:bookmarkEnd w:id="103"/>
-    <w:bookmarkStart w:id="104" w:name="acknowledgements"/>
+    <w:bookmarkStart w:id="130" w:name="references"/>
     <w:p>
       <w:pPr>
         <w:pStyle w:val="Heading1"/>
       </w:pPr>
       <w:r>
-        <w:t xml:space="preserve">Acknowledgements</w:t>
-      </w:r>
-    </w:p>
-    <w:p>
-      <w:pPr>
-        <w:pStyle w:val="FirstParagraph"/>
-      </w:pPr>
-      <w:r>
-        <w:t xml:space="preserve">The author thanks the supervisory team for guidance throughout the project. The EPANET Net3</w:t>
-      </w:r>
-      <w:r>
-        <w:t xml:space="preserve"> </w:t>
-      </w:r>
-      <w:r>
-        <w:t xml:space="preserve">example network is distributed with EPANET; all simulations were run through WNTR.</w:t>
-      </w:r>
-    </w:p>
-    <w:bookmarkEnd w:id="104"/>
-    <w:bookmarkStart w:id="119" w:name="references"/>
-    <w:p>
-      <w:pPr>
-        <w:pStyle w:val="Heading1"/>
-      </w:pPr>
-      <w:r>
         <w:t xml:space="preserve">References</w:t>
       </w:r>
     </w:p>
-    <w:bookmarkStart w:id="118" w:name="refs"/>
-    <w:bookmarkStart w:id="106" w:name="ref-BevenBinley1992"/>
+    <w:bookmarkStart w:id="129" w:name="refs"/>
+    <w:bookmarkStart w:id="105" w:name="ref-BevenBinley1992"/>
     <w:p>
       <w:pPr>
         <w:pStyle w:val="Bibliography"/>
@@ -20525,7 +20462,7 @@
       <w:r>
         <w:t xml:space="preserve"> </w:t>
       </w:r>
-      <w:hyperlink r:id="rId105">
+      <w:hyperlink r:id="rId104">
         <w:r>
           <w:rPr>
             <w:rStyle w:val="Hyperlink"/>
@@ -20537,8 +20474,100 @@
         <w:t xml:space="preserve">.</w:t>
       </w:r>
     </w:p>
-    <w:bookmarkEnd w:id="106"/>
-    <w:bookmarkStart w:id="107" w:name="ref-Hallam2002"/>
+    <w:bookmarkEnd w:id="105"/>
+    <w:bookmarkStart w:id="107" w:name="ref-BevenBinley2014"/>
+    <w:p>
+      <w:pPr>
+        <w:pStyle w:val="Bibliography"/>
+      </w:pPr>
+      <w:r>
+        <w:t xml:space="preserve">Beven, K. and Binley, A. (2014)</w:t>
+      </w:r>
+      <w:r>
+        <w:t xml:space="preserve"> </w:t>
+      </w:r>
+      <w:r>
+        <w:t xml:space="preserve">“</w:t>
+      </w:r>
+      <w:r>
+        <w:t xml:space="preserve">GLUE</w:t>
+      </w:r>
+      <w:r>
+        <w:t xml:space="preserve">: 20 years on,”</w:t>
+      </w:r>
+      <w:r>
+        <w:t xml:space="preserve"> </w:t>
+      </w:r>
+      <w:r>
+        <w:rPr>
+          <w:i/>
+          <w:iCs/>
+        </w:rPr>
+        <w:t xml:space="preserve">Hydrological Processes</w:t>
+      </w:r>
+      <w:r>
+        <w:t xml:space="preserve">, 28(24), pp. 5897–5918. Available at:</w:t>
+      </w:r>
+      <w:r>
+        <w:t xml:space="preserve"> </w:t>
+      </w:r>
+      <w:hyperlink r:id="rId106">
+        <w:r>
+          <w:rPr>
+            <w:rStyle w:val="Hyperlink"/>
+          </w:rPr>
+          <w:t xml:space="preserve">https://doi.org/10.1002/hyp.10082</w:t>
+        </w:r>
+      </w:hyperlink>
+      <w:r>
+        <w:t xml:space="preserve">.</w:t>
+      </w:r>
+    </w:p>
+    <w:bookmarkEnd w:id="107"/>
+    <w:bookmarkStart w:id="109" w:name="ref-Brun2001"/>
+    <w:p>
+      <w:pPr>
+        <w:pStyle w:val="Bibliography"/>
+      </w:pPr>
+      <w:r>
+        <w:t xml:space="preserve">Brun, R., Reichert, P. and Künsch, H.R. (2001)</w:t>
+      </w:r>
+      <w:r>
+        <w:t xml:space="preserve"> </w:t>
+      </w:r>
+      <w:r>
+        <w:t xml:space="preserve">“Practical identifiability analysis of large environmental simulation models,”</w:t>
+      </w:r>
+      <w:r>
+        <w:t xml:space="preserve"> </w:t>
+      </w:r>
+      <w:r>
+        <w:rPr>
+          <w:i/>
+          <w:iCs/>
+        </w:rPr>
+        <w:t xml:space="preserve">Water Resources Research</w:t>
+      </w:r>
+      <w:r>
+        <w:t xml:space="preserve">, 37(4), pp. 1015–1030. Available at:</w:t>
+      </w:r>
+      <w:r>
+        <w:t xml:space="preserve"> </w:t>
+      </w:r>
+      <w:hyperlink r:id="rId108">
+        <w:r>
+          <w:rPr>
+            <w:rStyle w:val="Hyperlink"/>
+          </w:rPr>
+          <w:t xml:space="preserve">https://doi.org/10.1029/2000WR900350</w:t>
+        </w:r>
+      </w:hyperlink>
+      <w:r>
+        <w:t xml:space="preserve">.</w:t>
+      </w:r>
+    </w:p>
+    <w:bookmarkEnd w:id="109"/>
+    <w:bookmarkStart w:id="110" w:name="ref-Hallam2002"/>
     <w:p>
       <w:pPr>
         <w:pStyle w:val="Bibliography"/>
@@ -20582,8 +20611,8 @@
         <w:t xml:space="preserve">, 36(14), pp. 3479–3488.</w:t>
       </w:r>
     </w:p>
-    <w:bookmarkEnd w:id="107"/>
-    <w:bookmarkStart w:id="109" w:name="ref-Klise2017WNTR"/>
+    <w:bookmarkEnd w:id="110"/>
+    <w:bookmarkStart w:id="112" w:name="ref-Klise2017WNTR"/>
     <w:p>
       <w:pPr>
         <w:pStyle w:val="Bibliography"/>
@@ -20629,7 +20658,7 @@
       <w:r>
         <w:t xml:space="preserve"> </w:t>
       </w:r>
-      <w:hyperlink r:id="rId108">
+      <w:hyperlink r:id="rId111">
         <w:r>
           <w:rPr>
             <w:rStyle w:val="Hyperlink"/>
@@ -20641,8 +20670,63 @@
         <w:t xml:space="preserve">.</w:t>
       </w:r>
     </w:p>
-    <w:bookmarkEnd w:id="109"/>
-    <w:bookmarkStart w:id="111" w:name="ref-Munavalli2003SteadyState"/>
+    <w:bookmarkEnd w:id="112"/>
+    <w:bookmarkStart w:id="114" w:name="ref-MantovanTodini2006"/>
+    <w:p>
+      <w:pPr>
+        <w:pStyle w:val="Bibliography"/>
+      </w:pPr>
+      <w:r>
+        <w:t xml:space="preserve">Mantovan, P. and Todini, E. (2006)</w:t>
+      </w:r>
+      <w:r>
+        <w:t xml:space="preserve"> </w:t>
+      </w:r>
+      <w:r>
+        <w:t xml:space="preserve">“Hydrological forecasting uncertainty assessment: Incoherence of the</w:t>
+      </w:r>
+      <w:r>
+        <w:t xml:space="preserve"> </w:t>
+      </w:r>
+      <w:r>
+        <w:t xml:space="preserve">GLUE</w:t>
+      </w:r>
+      <w:r>
+        <w:t xml:space="preserve"> </w:t>
+      </w:r>
+      <w:r>
+        <w:t xml:space="preserve">methodology,”</w:t>
+      </w:r>
+      <w:r>
+        <w:t xml:space="preserve"> </w:t>
+      </w:r>
+      <w:r>
+        <w:rPr>
+          <w:i/>
+          <w:iCs/>
+        </w:rPr>
+        <w:t xml:space="preserve">Journal of Hydrology</w:t>
+      </w:r>
+      <w:r>
+        <w:t xml:space="preserve">, 330(1–2), pp. 368–381. Available at:</w:t>
+      </w:r>
+      <w:r>
+        <w:t xml:space="preserve"> </w:t>
+      </w:r>
+      <w:hyperlink r:id="rId113">
+        <w:r>
+          <w:rPr>
+            <w:rStyle w:val="Hyperlink"/>
+          </w:rPr>
+          <w:t xml:space="preserve">https://doi.org/10.1016/j.jhydrol.2006.04.046</w:t>
+        </w:r>
+      </w:hyperlink>
+      <w:r>
+        <w:t xml:space="preserve">.</w:t>
+      </w:r>
+    </w:p>
+    <w:bookmarkEnd w:id="114"/>
+    <w:bookmarkStart w:id="116" w:name="ref-Munavalli2003SteadyState"/>
     <w:p>
       <w:pPr>
         <w:pStyle w:val="Bibliography"/>
@@ -20672,7 +20756,7 @@
       <w:r>
         <w:t xml:space="preserve"> </w:t>
       </w:r>
-      <w:hyperlink r:id="rId110">
+      <w:hyperlink r:id="rId115">
         <w:r>
           <w:rPr>
             <w:rStyle w:val="Hyperlink"/>
@@ -20684,8 +20768,8 @@
         <w:t xml:space="preserve">.</w:t>
       </w:r>
     </w:p>
-    <w:bookmarkEnd w:id="111"/>
-    <w:bookmarkStart w:id="113" w:name="ref-Nejjari2014ChlorineCalibration"/>
+    <w:bookmarkEnd w:id="116"/>
+    <w:bookmarkStart w:id="118" w:name="ref-Nejjari2014ChlorineCalibration"/>
     <w:p>
       <w:pPr>
         <w:pStyle w:val="Bibliography"/>
@@ -20731,7 +20815,7 @@
       <w:r>
         <w:t xml:space="preserve"> </w:t>
       </w:r>
-      <w:hyperlink r:id="rId112">
+      <w:hyperlink r:id="rId117">
         <w:r>
           <w:rPr>
             <w:rStyle w:val="Hyperlink"/>
@@ -20743,8 +20827,126 @@
         <w:t xml:space="preserve">.</w:t>
       </w:r>
     </w:p>
-    <w:bookmarkEnd w:id="113"/>
-    <w:bookmarkStart w:id="114" w:name="ref-Rossman2000"/>
+    <w:bookmarkEnd w:id="118"/>
+    <w:bookmarkStart w:id="120" w:name="ref-Powell2000"/>
+    <w:p>
+      <w:pPr>
+        <w:pStyle w:val="Bibliography"/>
+      </w:pPr>
+      <w:r>
+        <w:t xml:space="preserve">Powell, J.C.</w:t>
+      </w:r>
+      <w:r>
+        <w:t xml:space="preserve"> </w:t>
+      </w:r>
+      <w:r>
+        <w:rPr>
+          <w:i/>
+          <w:iCs/>
+        </w:rPr>
+        <w:t xml:space="preserve">et al.</w:t>
+      </w:r>
+      <w:r>
+        <w:t xml:space="preserve"> </w:t>
+      </w:r>
+      <w:r>
+        <w:t xml:space="preserve">(2000)</w:t>
+      </w:r>
+      <w:r>
+        <w:t xml:space="preserve"> </w:t>
+      </w:r>
+      <w:r>
+        <w:t xml:space="preserve">“Factors which control bulk chlorine decay rates,”</w:t>
+      </w:r>
+      <w:r>
+        <w:t xml:space="preserve"> </w:t>
+      </w:r>
+      <w:r>
+        <w:rPr>
+          <w:i/>
+          <w:iCs/>
+        </w:rPr>
+        <w:t xml:space="preserve">Water Research</w:t>
+      </w:r>
+      <w:r>
+        <w:t xml:space="preserve">, 34(1), pp. 117–126. Available at:</w:t>
+      </w:r>
+      <w:r>
+        <w:t xml:space="preserve"> </w:t>
+      </w:r>
+      <w:hyperlink r:id="rId119">
+        <w:r>
+          <w:rPr>
+            <w:rStyle w:val="Hyperlink"/>
+          </w:rPr>
+          <w:t xml:space="preserve">https://doi.org/10.1016/S0043-1354(99)00097-4</w:t>
+        </w:r>
+      </w:hyperlink>
+      <w:r>
+        <w:t xml:space="preserve">.</w:t>
+      </w:r>
+    </w:p>
+    <w:bookmarkEnd w:id="120"/>
+    <w:bookmarkStart w:id="122" w:name="ref-Raue2009"/>
+    <w:p>
+      <w:pPr>
+        <w:pStyle w:val="Bibliography"/>
+      </w:pPr>
+      <w:r>
+        <w:t xml:space="preserve">Raue, A.</w:t>
+      </w:r>
+      <w:r>
+        <w:t xml:space="preserve"> </w:t>
+      </w:r>
+      <w:r>
+        <w:rPr>
+          <w:i/>
+          <w:iCs/>
+        </w:rPr>
+        <w:t xml:space="preserve">et al.</w:t>
+      </w:r>
+      <w:r>
+        <w:t xml:space="preserve"> </w:t>
+      </w:r>
+      <w:r>
+        <w:t xml:space="preserve">(2009)</w:t>
+      </w:r>
+      <w:r>
+        <w:t xml:space="preserve"> </w:t>
+      </w:r>
+      <w:r>
+        <w:t xml:space="preserve">“Structural and practical identifiability analysis of partially observed dynamical models by exploiting the profile likelihood,”</w:t>
+      </w:r>
+      <w:r>
+        <w:t xml:space="preserve"> </w:t>
+      </w:r>
+      <w:r>
+        <w:rPr>
+          <w:i/>
+          <w:iCs/>
+        </w:rPr>
+        <w:t xml:space="preserve">Bioinformatics</w:t>
+      </w:r>
+      <w:r>
+        <w:t xml:space="preserve">, 25(15), pp. 1923–1929. Available at:</w:t>
+      </w:r>
+      <w:r>
+        <w:t xml:space="preserve"> </w:t>
+      </w:r>
+      <w:hyperlink r:id="rId121">
+        <w:r>
+          <w:rPr>
+            <w:rStyle w:val="Hyperlink"/>
+          </w:rPr>
+          <w:t xml:space="preserve">https://doi.org/10.1093/bioinformatics/btp358</w:t>
+        </w:r>
+      </w:hyperlink>
+      <w:r>
+        <w:t xml:space="preserve">.</w:t>
+      </w:r>
+    </w:p>
+    <w:bookmarkEnd w:id="122"/>
+    <w:bookmarkStart w:id="123" w:name="ref-Rossman2000"/>
     <w:p>
       <w:pPr>
         <w:pStyle w:val="Bibliography"/>
@@ -20780,8 +20982,8 @@
         <w:t xml:space="preserve">. Cincinnati, OH: U.S. Environmental Protection Agency.</w:t>
       </w:r>
     </w:p>
-    <w:bookmarkEnd w:id="114"/>
-    <w:bookmarkStart w:id="115" w:name="ref-Rossman2020"/>
+    <w:bookmarkEnd w:id="123"/>
+    <w:bookmarkStart w:id="124" w:name="ref-Rossman2020"/>
     <w:p>
       <w:pPr>
         <w:pStyle w:val="Bibliography"/>
@@ -20833,8 +21035,8 @@
         <w:t xml:space="preserve">. Cincinnati, OH: U.S. Environmental Protection Agency.</w:t>
       </w:r>
     </w:p>
-    <w:bookmarkEnd w:id="115"/>
-    <w:bookmarkStart w:id="116" w:name="ref-Rossman1994"/>
+    <w:bookmarkEnd w:id="124"/>
+    <w:bookmarkStart w:id="125" w:name="ref-Rossman1994"/>
     <w:p>
       <w:pPr>
         <w:pStyle w:val="Bibliography"/>
@@ -20862,14 +21064,14 @@
         <w:t xml:space="preserve">, 120(4), pp. 803–820.</w:t>
       </w:r>
     </w:p>
-    <w:bookmarkEnd w:id="116"/>
-    <w:bookmarkStart w:id="117" w:name="ref-Vasconcelos1997"/>
+    <w:bookmarkEnd w:id="125"/>
+    <w:bookmarkStart w:id="127" w:name="ref-Stedinger2008"/>
     <w:p>
       <w:pPr>
         <w:pStyle w:val="Bibliography"/>
       </w:pPr>
       <w:r>
-        <w:t xml:space="preserve">Vasconcelos, J.J.</w:t>
+        <w:t xml:space="preserve">Stedinger, J.R.</w:t>
       </w:r>
       <w:r>
         <w:t xml:space="preserve"> </w:t>
@@ -20885,6 +21087,71 @@
         <w:t xml:space="preserve"> </w:t>
       </w:r>
       <w:r>
+        <w:t xml:space="preserve">(2008)</w:t>
+      </w:r>
+      <w:r>
+        <w:t xml:space="preserve"> </w:t>
+      </w:r>
+      <w:r>
+        <w:t xml:space="preserve">“Appraisal of the generalized likelihood uncertainty estimation (</w:t>
+      </w:r>
+      <w:r>
+        <w:t xml:space="preserve">GLUE</w:t>
+      </w:r>
+      <w:r>
+        <w:t xml:space="preserve">) method,”</w:t>
+      </w:r>
+      <w:r>
+        <w:t xml:space="preserve"> </w:t>
+      </w:r>
+      <w:r>
+        <w:rPr>
+          <w:i/>
+          <w:iCs/>
+        </w:rPr>
+        <w:t xml:space="preserve">Water Resources Research</w:t>
+      </w:r>
+      <w:r>
+        <w:t xml:space="preserve">, 44(12), p. W00B06. Available at:</w:t>
+      </w:r>
+      <w:r>
+        <w:t xml:space="preserve"> </w:t>
+      </w:r>
+      <w:hyperlink r:id="rId126">
+        <w:r>
+          <w:rPr>
+            <w:rStyle w:val="Hyperlink"/>
+          </w:rPr>
+          <w:t xml:space="preserve">https://doi.org/10.1029/2008WR006822</w:t>
+        </w:r>
+      </w:hyperlink>
+      <w:r>
+        <w:t xml:space="preserve">.</w:t>
+      </w:r>
+    </w:p>
+    <w:bookmarkEnd w:id="127"/>
+    <w:bookmarkStart w:id="128" w:name="ref-Vasconcelos1997"/>
+    <w:p>
+      <w:pPr>
+        <w:pStyle w:val="Bibliography"/>
+      </w:pPr>
+      <w:r>
+        <w:t xml:space="preserve">Vasconcelos, J.J.</w:t>
+      </w:r>
+      <w:r>
+        <w:t xml:space="preserve"> </w:t>
+      </w:r>
+      <w:r>
+        <w:rPr>
+          <w:i/>
+          <w:iCs/>
+        </w:rPr>
+        <w:t xml:space="preserve">et al.</w:t>
+      </w:r>
+      <w:r>
+        <w:t xml:space="preserve"> </w:t>
+      </w:r>
+      <w:r>
         <w:t xml:space="preserve">(1997)</w:t>
       </w:r>
       <w:r>
@@ -20907,9 +21174,9 @@
         <w:t xml:space="preserve">, 89(7), pp. 54–65.</w:t>
       </w:r>
     </w:p>
-    <w:bookmarkEnd w:id="117"/>
-    <w:bookmarkEnd w:id="118"/>
-    <w:bookmarkEnd w:id="119"/>
+    <w:bookmarkEnd w:id="128"/>
+    <w:bookmarkEnd w:id="129"/>
+    <w:bookmarkEnd w:id="130"/>
     <w:sectPr>
       <w:pgSz w:h="16838" w:w="11906"/>
       <w:pgMar w:bottom="1417" w:footer="708" w:gutter="0" w:header="708" w:left="1417" w:right="1417" w:top="1417"/>

</xml_diff>